<commit_message>
Cover Letter: Replace Preprint Placeholder After medRxiv Rejection
Co-Authored-By: Claude Opus 5.5 <noreply@anthropic.com>
</commit_message>
<xml_diff>
--- a/submission/drug_safety/Cover_letter.docx
+++ b/submission/drug_safety/Cover_letter.docx
@@ -192,7 +192,13 @@
         <w:pStyle w:val="BodyText"/>
       </w:pPr>
       <w:r>
-        <w:t xml:space="preserve">The manuscript has not been published and is not under consideration elsewhere. [Preprint: to be confirmed by the author.]</w:t>
+        <w:t xml:space="preserve">The manuscript has not been published in a journal and is not under consideration elsewhere. A version of it is publicly</w:t>
+      </w:r>
+      <w:r>
+        <w:t xml:space="preserve"> </w:t>
+      </w:r>
+      <w:r>
+        <w:t xml:space="preserve">available together with the code (doi:10.5281/zenodo.23659658); it has not been posted on a preprint server.</w:t>
       </w:r>
       <w:r>
         <w:t xml:space="preserve"> </w:t>

</xml_diff>